<commit_message>
presentation: premium pitch deck with real UI screenshots
Feedback: the deck had one screenshot and too much text for a spoken
pitch, and the one it had showed offline mode - the fallback, not the
product. Also asked for full names on the title slide.

Captured the running app through CDP (headless Edge could not render
Streamlit on its own - the websocket never completes) and used those
real screens: result summary, expanded finding, template coverage.
Kept the LLM contradiction as the hero shot since offline heuristics
cannot produce that class of finding.

Slides are now visual-first with the speaker carrying the detail:
title with both names, problem loop, demo flow + result, LLM finding,
UI finding, coverage, architecture, readiness. Page numbers moved to
the top so full-bleed screenshots do not collide with them.

Co-Authored-By: Claude Opus 5 <noreply@anthropic.com>
</commit_message>
<xml_diff>
--- a/presentation/Питч — что говорить (5 минут).docx
+++ b/presentation/Питч — что говорить (5 минут).docx
@@ -380,7 +380,7 @@
           <w:sz w:val="19"/>
           <w:szCs w:val="19"/>
         </w:rPr>
-        <w:t xml:space="preserve">Слайды 3–4 · Сценарий и находка · самая большая часть питча — 2 минуты 10 секунд</w:t>
+        <w:t xml:space="preserve">Слайды 3–6 · Экран, находка, интерфейс, покрытие · самая большая часть питча — 2 минуты 10 секунд</w:t>
       </w:r>
     </w:p>
     <w:p>
@@ -609,7 +609,7 @@
           <w:sz w:val="19"/>
           <w:szCs w:val="19"/>
         </w:rPr>
-        <w:t xml:space="preserve">Слайд 5 · Архитектура · защищаем выбор решения, а не перечисляем стек</w:t>
+        <w:t xml:space="preserve">Слайд 7 · Архитектура · защищаем выбор решения, а не перечисляем стек</w:t>
       </w:r>
     </w:p>
     <w:p>
@@ -685,7 +685,7 @@
           <w:sz w:val="19"/>
           <w:szCs w:val="19"/>
         </w:rPr>
-        <w:t xml:space="preserve">Слайды 6–7 · Метрики и готовность · разделяем измеренное и гипотезу, потом финальная фраза</w:t>
+        <w:t xml:space="preserve">Слайд 8 · Готовность · разделяем измеренное и гипотезу, потом финальная фраза</w:t>
       </w:r>
     </w:p>
     <w:p>

</xml_diff>